<commit_message>
added model with only TSM + Chla, neue version der Klassenunterschiede über dei zeit darstellung
</commit_message>
<xml_diff>
--- a/output/04_timeseries_results_diff_LC08-09/diffplots_WORD.docx
+++ b/output/04_timeseries_results_diff_LC08-09/diffplots_WORD.docx
@@ -10,7 +10,7 @@
           <w:noProof/>
         </w:rPr>
         <w:drawing>
-          <wp:anchor distT="0" distB="0" distL="114300" distR="114300" simplePos="0" relativeHeight="251681792" behindDoc="0" locked="0" layoutInCell="1" allowOverlap="1" wp14:anchorId="1767B69E" wp14:editId="2D059A83">
+          <wp:anchor distT="0" distB="0" distL="114300" distR="114300" simplePos="0" relativeHeight="251681792" behindDoc="0" locked="0" layoutInCell="1" allowOverlap="1" wp14:anchorId="1767B69E" wp14:editId="17ECA270">
             <wp:simplePos x="0" y="0"/>
             <wp:positionH relativeFrom="column">
               <wp:posOffset>0</wp:posOffset>
@@ -620,7 +620,7 @@
           <w:noProof/>
         </w:rPr>
         <w:drawing>
-          <wp:anchor distT="0" distB="0" distL="114300" distR="114300" simplePos="0" relativeHeight="251683840" behindDoc="0" locked="0" layoutInCell="1" allowOverlap="1" wp14:anchorId="09009BA2" wp14:editId="7E93974B">
+          <wp:anchor distT="0" distB="0" distL="114300" distR="114300" simplePos="0" relativeHeight="251683840" behindDoc="0" locked="0" layoutInCell="1" allowOverlap="1" wp14:anchorId="09009BA2" wp14:editId="625EB12B">
             <wp:simplePos x="0" y="0"/>
             <wp:positionH relativeFrom="column">
               <wp:posOffset>6664325</wp:posOffset>
@@ -1098,6 +1098,1108 @@
                 </pic:pic>
               </a:graphicData>
             </a:graphic>
+            <wp14:sizeRelV relativeFrom="margin">
+              <wp14:pctHeight>0</wp14:pctHeight>
+            </wp14:sizeRelV>
+          </wp:anchor>
+        </w:drawing>
+      </w:r>
+    </w:p>
+    <w:p/>
+    <w:p/>
+    <w:p/>
+    <w:p/>
+    <w:p/>
+    <w:p/>
+    <w:p/>
+    <w:p/>
+    <w:p/>
+    <w:p/>
+    <w:p/>
+    <w:p/>
+    <w:p/>
+    <w:p/>
+    <w:p/>
+    <w:p/>
+    <w:p/>
+    <w:p/>
+    <w:p>
+      <w:pPr>
+        <w:tabs>
+          <w:tab w:val="left" w:pos="3734"/>
+        </w:tabs>
+      </w:pPr>
+      <w:r>
+        <w:tab/>
+      </w:r>
+    </w:p>
+    <w:p>
+      <w:pPr>
+        <w:tabs>
+          <w:tab w:val="left" w:pos="3734"/>
+        </w:tabs>
+      </w:pPr>
+    </w:p>
+    <w:p>
+      <w:pPr>
+        <w:tabs>
+          <w:tab w:val="left" w:pos="3734"/>
+        </w:tabs>
+      </w:pPr>
+    </w:p>
+    <w:p>
+      <w:pPr>
+        <w:tabs>
+          <w:tab w:val="left" w:pos="3734"/>
+        </w:tabs>
+      </w:pPr>
+    </w:p>
+    <w:p>
+      <w:pPr>
+        <w:tabs>
+          <w:tab w:val="left" w:pos="3734"/>
+        </w:tabs>
+      </w:pPr>
+    </w:p>
+    <w:p>
+      <w:pPr>
+        <w:tabs>
+          <w:tab w:val="left" w:pos="3734"/>
+        </w:tabs>
+      </w:pPr>
+    </w:p>
+    <w:p>
+      <w:pPr>
+        <w:tabs>
+          <w:tab w:val="left" w:pos="3734"/>
+        </w:tabs>
+      </w:pPr>
+    </w:p>
+    <w:p>
+      <w:pPr>
+        <w:tabs>
+          <w:tab w:val="left" w:pos="3734"/>
+        </w:tabs>
+      </w:pPr>
+    </w:p>
+    <w:p>
+      <w:pPr>
+        <w:tabs>
+          <w:tab w:val="left" w:pos="3734"/>
+        </w:tabs>
+      </w:pPr>
+    </w:p>
+    <w:p>
+      <w:pPr>
+        <w:tabs>
+          <w:tab w:val="left" w:pos="3734"/>
+        </w:tabs>
+      </w:pPr>
+    </w:p>
+    <w:p>
+      <w:pPr>
+        <w:tabs>
+          <w:tab w:val="left" w:pos="3734"/>
+        </w:tabs>
+      </w:pPr>
+      <w:r>
+        <w:rPr>
+          <w:noProof/>
+        </w:rPr>
+        <w:drawing>
+          <wp:anchor distT="0" distB="0" distL="114300" distR="114300" simplePos="0" relativeHeight="251626468" behindDoc="0" locked="0" layoutInCell="1" allowOverlap="1" wp14:anchorId="59348196" wp14:editId="43DE74EA">
+            <wp:simplePos x="0" y="0"/>
+            <wp:positionH relativeFrom="column">
+              <wp:posOffset>520065</wp:posOffset>
+            </wp:positionH>
+            <wp:positionV relativeFrom="paragraph">
+              <wp:posOffset>169628</wp:posOffset>
+            </wp:positionV>
+            <wp:extent cx="7614920" cy="4761230"/>
+            <wp:effectExtent l="0" t="0" r="5080" b="1270"/>
+            <wp:wrapSquare wrapText="bothSides"/>
+            <wp:docPr id="1349499261" name="Grafik 6"/>
+            <wp:cNvGraphicFramePr>
+              <a:graphicFrameLocks xmlns:a="http://schemas.openxmlformats.org/drawingml/2006/main" noChangeAspect="1"/>
+            </wp:cNvGraphicFramePr>
+            <a:graphic xmlns:a="http://schemas.openxmlformats.org/drawingml/2006/main">
+              <a:graphicData uri="http://schemas.openxmlformats.org/drawingml/2006/picture">
+                <pic:pic xmlns:pic="http://schemas.openxmlformats.org/drawingml/2006/picture">
+                  <pic:nvPicPr>
+                    <pic:cNvPr id="0" name="Picture 10"/>
+                    <pic:cNvPicPr>
+                      <a:picLocks noChangeAspect="1" noChangeArrowheads="1"/>
+                    </pic:cNvPicPr>
+                  </pic:nvPicPr>
+                  <pic:blipFill>
+                    <a:blip r:embed="rId16">
+                      <a:extLst>
+                        <a:ext uri="{28A0092B-C50C-407E-A947-70E740481C1C}">
+                          <a14:useLocalDpi xmlns:a14="http://schemas.microsoft.com/office/drawing/2010/main" val="0"/>
+                        </a:ext>
+                      </a:extLst>
+                    </a:blip>
+                    <a:srcRect/>
+                    <a:stretch>
+                      <a:fillRect/>
+                    </a:stretch>
+                  </pic:blipFill>
+                  <pic:spPr bwMode="auto">
+                    <a:xfrm>
+                      <a:off x="0" y="0"/>
+                      <a:ext cx="7614920" cy="4761230"/>
+                    </a:xfrm>
+                    <a:prstGeom prst="rect">
+                      <a:avLst/>
+                    </a:prstGeom>
+                    <a:noFill/>
+                    <a:ln>
+                      <a:noFill/>
+                    </a:ln>
+                  </pic:spPr>
+                </pic:pic>
+              </a:graphicData>
+            </a:graphic>
+          </wp:anchor>
+        </w:drawing>
+      </w:r>
+      <w:r>
+        <w:rPr>
+          <w:noProof/>
+        </w:rPr>
+        <w:drawing>
+          <wp:anchor distT="0" distB="0" distL="114300" distR="114300" simplePos="0" relativeHeight="251694080" behindDoc="0" locked="0" layoutInCell="1" allowOverlap="1" wp14:anchorId="1F2B93EF" wp14:editId="25DB211C">
+            <wp:simplePos x="0" y="0"/>
+            <wp:positionH relativeFrom="column">
+              <wp:posOffset>5226685</wp:posOffset>
+            </wp:positionH>
+            <wp:positionV relativeFrom="paragraph">
+              <wp:posOffset>4878070</wp:posOffset>
+            </wp:positionV>
+            <wp:extent cx="1969770" cy="199390"/>
+            <wp:effectExtent l="0" t="0" r="0" b="0"/>
+            <wp:wrapSquare wrapText="bothSides"/>
+            <wp:docPr id="1900189558" name="Grafik 33"/>
+            <wp:cNvGraphicFramePr>
+              <a:graphicFrameLocks xmlns:a="http://schemas.openxmlformats.org/drawingml/2006/main" noChangeAspect="1"/>
+            </wp:cNvGraphicFramePr>
+            <a:graphic xmlns:a="http://schemas.openxmlformats.org/drawingml/2006/main">
+              <a:graphicData uri="http://schemas.openxmlformats.org/drawingml/2006/picture">
+                <pic:pic xmlns:pic="http://schemas.openxmlformats.org/drawingml/2006/picture">
+                  <pic:nvPicPr>
+                    <pic:cNvPr id="0" name="Picture 68"/>
+                    <pic:cNvPicPr>
+                      <a:picLocks noChangeAspect="1" noChangeArrowheads="1"/>
+                    </pic:cNvPicPr>
+                  </pic:nvPicPr>
+                  <pic:blipFill rotWithShape="1">
+                    <a:blip r:embed="rId5">
+                      <a:extLst>
+                        <a:ext uri="{28A0092B-C50C-407E-A947-70E740481C1C}">
+                          <a14:useLocalDpi xmlns:a14="http://schemas.microsoft.com/office/drawing/2010/main" val="0"/>
+                        </a:ext>
+                      </a:extLst>
+                    </a:blip>
+                    <a:srcRect l="59113" t="41415" b="52377"/>
+                    <a:stretch>
+                      <a:fillRect/>
+                    </a:stretch>
+                  </pic:blipFill>
+                  <pic:spPr bwMode="auto">
+                    <a:xfrm>
+                      <a:off x="0" y="0"/>
+                      <a:ext cx="1969770" cy="199390"/>
+                    </a:xfrm>
+                    <a:prstGeom prst="rect">
+                      <a:avLst/>
+                    </a:prstGeom>
+                    <a:noFill/>
+                    <a:ln>
+                      <a:noFill/>
+                    </a:ln>
+                    <a:extLst>
+                      <a:ext uri="{53640926-AAD7-44D8-BBD7-CCE9431645EC}">
+                        <a14:shadowObscured xmlns:a14="http://schemas.microsoft.com/office/drawing/2010/main"/>
+                      </a:ext>
+                    </a:extLst>
+                  </pic:spPr>
+                </pic:pic>
+              </a:graphicData>
+            </a:graphic>
+            <wp14:sizeRelV relativeFrom="margin">
+              <wp14:pctHeight>0</wp14:pctHeight>
+            </wp14:sizeRelV>
+          </wp:anchor>
+        </w:drawing>
+      </w:r>
+      <w:r>
+        <w:rPr>
+          <w:noProof/>
+        </w:rPr>
+        <w:drawing>
+          <wp:anchor distT="0" distB="0" distL="114300" distR="114300" simplePos="0" relativeHeight="251693056" behindDoc="0" locked="0" layoutInCell="1" allowOverlap="1" wp14:anchorId="0FA28398" wp14:editId="1946A72A">
+            <wp:simplePos x="0" y="0"/>
+            <wp:positionH relativeFrom="column">
+              <wp:posOffset>3305810</wp:posOffset>
+            </wp:positionH>
+            <wp:positionV relativeFrom="paragraph">
+              <wp:posOffset>4855845</wp:posOffset>
+            </wp:positionV>
+            <wp:extent cx="1969770" cy="379730"/>
+            <wp:effectExtent l="0" t="0" r="0" b="1270"/>
+            <wp:wrapSquare wrapText="bothSides"/>
+            <wp:docPr id="1940859196" name="Grafik 33"/>
+            <wp:cNvGraphicFramePr>
+              <a:graphicFrameLocks xmlns:a="http://schemas.openxmlformats.org/drawingml/2006/main" noChangeAspect="1"/>
+            </wp:cNvGraphicFramePr>
+            <a:graphic xmlns:a="http://schemas.openxmlformats.org/drawingml/2006/main">
+              <a:graphicData uri="http://schemas.openxmlformats.org/drawingml/2006/picture">
+                <pic:pic xmlns:pic="http://schemas.openxmlformats.org/drawingml/2006/picture">
+                  <pic:nvPicPr>
+                    <pic:cNvPr id="0" name="Picture 68"/>
+                    <pic:cNvPicPr>
+                      <a:picLocks noChangeAspect="1" noChangeArrowheads="1"/>
+                    </pic:cNvPicPr>
+                  </pic:nvPicPr>
+                  <pic:blipFill rotWithShape="1">
+                    <a:blip r:embed="rId5">
+                      <a:extLst>
+                        <a:ext uri="{28A0092B-C50C-407E-A947-70E740481C1C}">
+                          <a14:useLocalDpi xmlns:a14="http://schemas.microsoft.com/office/drawing/2010/main" val="0"/>
+                        </a:ext>
+                      </a:extLst>
+                    </a:blip>
+                    <a:srcRect l="59113" t="29177" b="59022"/>
+                    <a:stretch>
+                      <a:fillRect/>
+                    </a:stretch>
+                  </pic:blipFill>
+                  <pic:spPr bwMode="auto">
+                    <a:xfrm>
+                      <a:off x="0" y="0"/>
+                      <a:ext cx="1969770" cy="379730"/>
+                    </a:xfrm>
+                    <a:prstGeom prst="rect">
+                      <a:avLst/>
+                    </a:prstGeom>
+                    <a:noFill/>
+                    <a:ln>
+                      <a:noFill/>
+                    </a:ln>
+                    <a:extLst>
+                      <a:ext uri="{53640926-AAD7-44D8-BBD7-CCE9431645EC}">
+                        <a14:shadowObscured xmlns:a14="http://schemas.microsoft.com/office/drawing/2010/main"/>
+                      </a:ext>
+                    </a:extLst>
+                  </pic:spPr>
+                </pic:pic>
+              </a:graphicData>
+            </a:graphic>
+            <wp14:sizeRelV relativeFrom="margin">
+              <wp14:pctHeight>0</wp14:pctHeight>
+            </wp14:sizeRelV>
+          </wp:anchor>
+        </w:drawing>
+      </w:r>
+      <w:r>
+        <w:rPr>
+          <w:noProof/>
+        </w:rPr>
+        <w:drawing>
+          <wp:anchor distT="0" distB="0" distL="114300" distR="114300" simplePos="0" relativeHeight="251691008" behindDoc="0" locked="0" layoutInCell="1" allowOverlap="1" wp14:anchorId="3C1D0CD1" wp14:editId="5FE6187F">
+            <wp:simplePos x="0" y="0"/>
+            <wp:positionH relativeFrom="column">
+              <wp:posOffset>1528445</wp:posOffset>
+            </wp:positionH>
+            <wp:positionV relativeFrom="paragraph">
+              <wp:posOffset>4829175</wp:posOffset>
+            </wp:positionV>
+            <wp:extent cx="1969770" cy="394970"/>
+            <wp:effectExtent l="0" t="0" r="0" b="5080"/>
+            <wp:wrapSquare wrapText="bothSides"/>
+            <wp:docPr id="1796429664" name="Grafik 33"/>
+            <wp:cNvGraphicFramePr>
+              <a:graphicFrameLocks xmlns:a="http://schemas.openxmlformats.org/drawingml/2006/main" noChangeAspect="1"/>
+            </wp:cNvGraphicFramePr>
+            <a:graphic xmlns:a="http://schemas.openxmlformats.org/drawingml/2006/main">
+              <a:graphicData uri="http://schemas.openxmlformats.org/drawingml/2006/picture">
+                <pic:pic xmlns:pic="http://schemas.openxmlformats.org/drawingml/2006/picture">
+                  <pic:nvPicPr>
+                    <pic:cNvPr id="0" name="Picture 68"/>
+                    <pic:cNvPicPr>
+                      <a:picLocks noChangeAspect="1" noChangeArrowheads="1"/>
+                    </pic:cNvPicPr>
+                  </pic:nvPicPr>
+                  <pic:blipFill rotWithShape="1">
+                    <a:blip r:embed="rId5">
+                      <a:extLst>
+                        <a:ext uri="{28A0092B-C50C-407E-A947-70E740481C1C}">
+                          <a14:useLocalDpi xmlns:a14="http://schemas.microsoft.com/office/drawing/2010/main" val="0"/>
+                        </a:ext>
+                      </a:extLst>
+                    </a:blip>
+                    <a:srcRect l="59113" t="17200" b="70519"/>
+                    <a:stretch>
+                      <a:fillRect/>
+                    </a:stretch>
+                  </pic:blipFill>
+                  <pic:spPr bwMode="auto">
+                    <a:xfrm>
+                      <a:off x="0" y="0"/>
+                      <a:ext cx="1969770" cy="394970"/>
+                    </a:xfrm>
+                    <a:prstGeom prst="rect">
+                      <a:avLst/>
+                    </a:prstGeom>
+                    <a:noFill/>
+                    <a:ln>
+                      <a:noFill/>
+                    </a:ln>
+                    <a:extLst>
+                      <a:ext uri="{53640926-AAD7-44D8-BBD7-CCE9431645EC}">
+                        <a14:shadowObscured xmlns:a14="http://schemas.microsoft.com/office/drawing/2010/main"/>
+                      </a:ext>
+                    </a:extLst>
+                  </pic:spPr>
+                </pic:pic>
+              </a:graphicData>
+            </a:graphic>
+            <wp14:sizeRelV relativeFrom="margin">
+              <wp14:pctHeight>0</wp14:pctHeight>
+            </wp14:sizeRelV>
+          </wp:anchor>
+        </w:drawing>
+      </w:r>
+    </w:p>
+    <w:p/>
+    <w:p/>
+    <w:p/>
+    <w:p/>
+    <w:p/>
+    <w:p/>
+    <w:p/>
+    <w:p/>
+    <w:p/>
+    <w:p/>
+    <w:p/>
+    <w:p/>
+    <w:p/>
+    <w:p/>
+    <w:p/>
+    <w:p/>
+    <w:p/>
+    <w:p/>
+    <w:p/>
+    <w:p/>
+    <w:p/>
+    <w:p/>
+    <w:p/>
+    <w:p/>
+    <w:p/>
+    <w:p/>
+    <w:p/>
+    <w:p/>
+    <w:p/>
+    <w:p/>
+    <w:p/>
+    <w:p/>
+    <w:p>
+      <w:r>
+        <w:rPr>
+          <w:noProof/>
+        </w:rPr>
+        <w:drawing>
+          <wp:anchor distT="0" distB="0" distL="114300" distR="114300" simplePos="0" relativeHeight="251625443" behindDoc="0" locked="0" layoutInCell="1" allowOverlap="1" wp14:anchorId="57C41EEE" wp14:editId="46E0DBD7">
+            <wp:simplePos x="0" y="0"/>
+            <wp:positionH relativeFrom="column">
+              <wp:posOffset>67310</wp:posOffset>
+            </wp:positionH>
+            <wp:positionV relativeFrom="paragraph">
+              <wp:posOffset>21590</wp:posOffset>
+            </wp:positionV>
+            <wp:extent cx="7623175" cy="4761865"/>
+            <wp:effectExtent l="0" t="0" r="0" b="635"/>
+            <wp:wrapSquare wrapText="bothSides"/>
+            <wp:docPr id="1382966139" name="Grafik 9"/>
+            <wp:cNvGraphicFramePr>
+              <a:graphicFrameLocks xmlns:a="http://schemas.openxmlformats.org/drawingml/2006/main" noChangeAspect="1"/>
+            </wp:cNvGraphicFramePr>
+            <a:graphic xmlns:a="http://schemas.openxmlformats.org/drawingml/2006/main">
+              <a:graphicData uri="http://schemas.openxmlformats.org/drawingml/2006/picture">
+                <pic:pic xmlns:pic="http://schemas.openxmlformats.org/drawingml/2006/picture">
+                  <pic:nvPicPr>
+                    <pic:cNvPr id="0" name="Picture 16"/>
+                    <pic:cNvPicPr>
+                      <a:picLocks noChangeAspect="1" noChangeArrowheads="1"/>
+                    </pic:cNvPicPr>
+                  </pic:nvPicPr>
+                  <pic:blipFill>
+                    <a:blip r:embed="rId17">
+                      <a:extLst>
+                        <a:ext uri="{28A0092B-C50C-407E-A947-70E740481C1C}">
+                          <a14:useLocalDpi xmlns:a14="http://schemas.microsoft.com/office/drawing/2010/main" val="0"/>
+                        </a:ext>
+                      </a:extLst>
+                    </a:blip>
+                    <a:srcRect/>
+                    <a:stretch>
+                      <a:fillRect/>
+                    </a:stretch>
+                  </pic:blipFill>
+                  <pic:spPr bwMode="auto">
+                    <a:xfrm>
+                      <a:off x="0" y="0"/>
+                      <a:ext cx="7623175" cy="4761865"/>
+                    </a:xfrm>
+                    <a:prstGeom prst="rect">
+                      <a:avLst/>
+                    </a:prstGeom>
+                    <a:noFill/>
+                    <a:ln>
+                      <a:noFill/>
+                    </a:ln>
+                  </pic:spPr>
+                </pic:pic>
+              </a:graphicData>
+            </a:graphic>
+          </wp:anchor>
+        </w:drawing>
+      </w:r>
+    </w:p>
+    <w:p>
+      <w:pPr>
+        <w:rPr>
+          <w:noProof/>
+        </w:rPr>
+      </w:pPr>
+      <w:r>
+        <w:rPr>
+          <w:noProof/>
+        </w:rPr>
+        <w:drawing>
+          <wp:anchor distT="0" distB="0" distL="114300" distR="114300" simplePos="0" relativeHeight="251701248" behindDoc="0" locked="0" layoutInCell="1" allowOverlap="1" wp14:anchorId="4031FFF0" wp14:editId="0A2BC893">
+            <wp:simplePos x="0" y="0"/>
+            <wp:positionH relativeFrom="column">
+              <wp:posOffset>263362</wp:posOffset>
+            </wp:positionH>
+            <wp:positionV relativeFrom="paragraph">
+              <wp:posOffset>123190</wp:posOffset>
+            </wp:positionV>
+            <wp:extent cx="703580" cy="1562735"/>
+            <wp:effectExtent l="0" t="0" r="1270" b="0"/>
+            <wp:wrapSquare wrapText="bothSides"/>
+            <wp:docPr id="1820314460" name="Grafik 7"/>
+            <wp:cNvGraphicFramePr>
+              <a:graphicFrameLocks xmlns:a="http://schemas.openxmlformats.org/drawingml/2006/main" noChangeAspect="1"/>
+            </wp:cNvGraphicFramePr>
+            <a:graphic xmlns:a="http://schemas.openxmlformats.org/drawingml/2006/main">
+              <a:graphicData uri="http://schemas.openxmlformats.org/drawingml/2006/picture">
+                <pic:pic xmlns:pic="http://schemas.openxmlformats.org/drawingml/2006/picture">
+                  <pic:nvPicPr>
+                    <pic:cNvPr id="0" name="Picture 11"/>
+                    <pic:cNvPicPr>
+                      <a:picLocks noChangeAspect="1" noChangeArrowheads="1"/>
+                    </pic:cNvPicPr>
+                  </pic:nvPicPr>
+                  <pic:blipFill rotWithShape="1">
+                    <a:blip r:embed="rId18">
+                      <a:extLst>
+                        <a:ext uri="{28A0092B-C50C-407E-A947-70E740481C1C}">
+                          <a14:useLocalDpi xmlns:a14="http://schemas.microsoft.com/office/drawing/2010/main" val="0"/>
+                        </a:ext>
+                      </a:extLst>
+                    </a:blip>
+                    <a:srcRect l="64802" t="8460" r="19874" b="36994"/>
+                    <a:stretch>
+                      <a:fillRect/>
+                    </a:stretch>
+                  </pic:blipFill>
+                  <pic:spPr bwMode="auto">
+                    <a:xfrm>
+                      <a:off x="0" y="0"/>
+                      <a:ext cx="703580" cy="1562735"/>
+                    </a:xfrm>
+                    <a:prstGeom prst="rect">
+                      <a:avLst/>
+                    </a:prstGeom>
+                    <a:noFill/>
+                    <a:ln>
+                      <a:noFill/>
+                    </a:ln>
+                    <a:extLst>
+                      <a:ext uri="{53640926-AAD7-44D8-BBD7-CCE9431645EC}">
+                        <a14:shadowObscured xmlns:a14="http://schemas.microsoft.com/office/drawing/2010/main"/>
+                      </a:ext>
+                    </a:extLst>
+                  </pic:spPr>
+                </pic:pic>
+              </a:graphicData>
+            </a:graphic>
+            <wp14:sizeRelH relativeFrom="margin">
+              <wp14:pctWidth>0</wp14:pctWidth>
+            </wp14:sizeRelH>
+            <wp14:sizeRelV relativeFrom="margin">
+              <wp14:pctHeight>0</wp14:pctHeight>
+            </wp14:sizeRelV>
+          </wp:anchor>
+        </w:drawing>
+      </w:r>
+      <w:r>
+        <w:rPr>
+          <w:noProof/>
+        </w:rPr>
+        <w:drawing>
+          <wp:anchor distT="0" distB="0" distL="114300" distR="114300" simplePos="0" relativeHeight="251707392" behindDoc="0" locked="0" layoutInCell="1" allowOverlap="1" wp14:anchorId="0CD89EBB" wp14:editId="3CA38C77">
+            <wp:simplePos x="0" y="0"/>
+            <wp:positionH relativeFrom="column">
+              <wp:posOffset>941705</wp:posOffset>
+            </wp:positionH>
+            <wp:positionV relativeFrom="paragraph">
+              <wp:posOffset>123044</wp:posOffset>
+            </wp:positionV>
+            <wp:extent cx="703385" cy="1042449"/>
+            <wp:effectExtent l="0" t="0" r="1905" b="5715"/>
+            <wp:wrapSquare wrapText="bothSides"/>
+            <wp:docPr id="823688076" name="Grafik 7"/>
+            <wp:cNvGraphicFramePr>
+              <a:graphicFrameLocks xmlns:a="http://schemas.openxmlformats.org/drawingml/2006/main" noChangeAspect="1"/>
+            </wp:cNvGraphicFramePr>
+            <a:graphic xmlns:a="http://schemas.openxmlformats.org/drawingml/2006/main">
+              <a:graphicData uri="http://schemas.openxmlformats.org/drawingml/2006/picture">
+                <pic:pic xmlns:pic="http://schemas.openxmlformats.org/drawingml/2006/picture">
+                  <pic:nvPicPr>
+                    <pic:cNvPr id="0" name="Picture 11"/>
+                    <pic:cNvPicPr>
+                      <a:picLocks noChangeAspect="1" noChangeArrowheads="1"/>
+                    </pic:cNvPicPr>
+                  </pic:nvPicPr>
+                  <pic:blipFill rotWithShape="1">
+                    <a:blip r:embed="rId18">
+                      <a:extLst>
+                        <a:ext uri="{28A0092B-C50C-407E-A947-70E740481C1C}">
+                          <a14:useLocalDpi xmlns:a14="http://schemas.microsoft.com/office/drawing/2010/main" val="0"/>
+                        </a:ext>
+                      </a:extLst>
+                    </a:blip>
+                    <a:srcRect l="64403" t="63526" r="20273" b="88"/>
+                    <a:stretch>
+                      <a:fillRect/>
+                    </a:stretch>
+                  </pic:blipFill>
+                  <pic:spPr bwMode="auto">
+                    <a:xfrm>
+                      <a:off x="0" y="0"/>
+                      <a:ext cx="703385" cy="1042449"/>
+                    </a:xfrm>
+                    <a:prstGeom prst="rect">
+                      <a:avLst/>
+                    </a:prstGeom>
+                    <a:noFill/>
+                    <a:ln>
+                      <a:noFill/>
+                    </a:ln>
+                    <a:extLst>
+                      <a:ext uri="{53640926-AAD7-44D8-BBD7-CCE9431645EC}">
+                        <a14:shadowObscured xmlns:a14="http://schemas.microsoft.com/office/drawing/2010/main"/>
+                      </a:ext>
+                    </a:extLst>
+                  </pic:spPr>
+                </pic:pic>
+              </a:graphicData>
+            </a:graphic>
+            <wp14:sizeRelH relativeFrom="margin">
+              <wp14:pctWidth>0</wp14:pctWidth>
+            </wp14:sizeRelH>
+            <wp14:sizeRelV relativeFrom="margin">
+              <wp14:pctHeight>0</wp14:pctHeight>
+            </wp14:sizeRelV>
+          </wp:anchor>
+        </w:drawing>
+      </w:r>
+    </w:p>
+    <w:p/>
+    <w:p/>
+    <w:p/>
+    <w:p/>
+    <w:p/>
+    <w:p>
+      <w:pPr>
+        <w:tabs>
+          <w:tab w:val="left" w:pos="15741"/>
+        </w:tabs>
+      </w:pPr>
+      <w:r>
+        <w:tab/>
+      </w:r>
+    </w:p>
+    <w:p>
+      <w:pPr>
+        <w:tabs>
+          <w:tab w:val="left" w:pos="15741"/>
+        </w:tabs>
+      </w:pPr>
+    </w:p>
+    <w:p>
+      <w:pPr>
+        <w:tabs>
+          <w:tab w:val="left" w:pos="15741"/>
+        </w:tabs>
+      </w:pPr>
+    </w:p>
+    <w:p>
+      <w:pPr>
+        <w:tabs>
+          <w:tab w:val="left" w:pos="15741"/>
+        </w:tabs>
+      </w:pPr>
+    </w:p>
+    <w:p>
+      <w:pPr>
+        <w:tabs>
+          <w:tab w:val="left" w:pos="15741"/>
+        </w:tabs>
+      </w:pPr>
+    </w:p>
+    <w:p>
+      <w:pPr>
+        <w:tabs>
+          <w:tab w:val="left" w:pos="15741"/>
+        </w:tabs>
+      </w:pPr>
+    </w:p>
+    <w:p>
+      <w:pPr>
+        <w:tabs>
+          <w:tab w:val="left" w:pos="15741"/>
+        </w:tabs>
+      </w:pPr>
+    </w:p>
+    <w:p>
+      <w:pPr>
+        <w:tabs>
+          <w:tab w:val="left" w:pos="15741"/>
+        </w:tabs>
+      </w:pPr>
+    </w:p>
+    <w:p>
+      <w:pPr>
+        <w:tabs>
+          <w:tab w:val="left" w:pos="15741"/>
+        </w:tabs>
+      </w:pPr>
+    </w:p>
+    <w:p>
+      <w:pPr>
+        <w:tabs>
+          <w:tab w:val="left" w:pos="15741"/>
+        </w:tabs>
+      </w:pPr>
+    </w:p>
+    <w:p>
+      <w:pPr>
+        <w:tabs>
+          <w:tab w:val="left" w:pos="15741"/>
+        </w:tabs>
+      </w:pPr>
+    </w:p>
+    <w:p>
+      <w:pPr>
+        <w:tabs>
+          <w:tab w:val="left" w:pos="15741"/>
+        </w:tabs>
+      </w:pPr>
+    </w:p>
+    <w:p>
+      <w:pPr>
+        <w:tabs>
+          <w:tab w:val="left" w:pos="15741"/>
+        </w:tabs>
+      </w:pPr>
+      <w:r>
+        <w:rPr>
+          <w:noProof/>
+        </w:rPr>
+        <w:lastRenderedPageBreak/>
+        <w:drawing>
+          <wp:anchor distT="0" distB="0" distL="114300" distR="114300" simplePos="0" relativeHeight="251628518" behindDoc="0" locked="0" layoutInCell="1" allowOverlap="1" wp14:anchorId="4670E208" wp14:editId="262C6B6F">
+            <wp:simplePos x="0" y="0"/>
+            <wp:positionH relativeFrom="column">
+              <wp:posOffset>-94572</wp:posOffset>
+            </wp:positionH>
+            <wp:positionV relativeFrom="paragraph">
+              <wp:posOffset>252095</wp:posOffset>
+            </wp:positionV>
+            <wp:extent cx="7614920" cy="7614920"/>
+            <wp:effectExtent l="0" t="0" r="5080" b="5080"/>
+            <wp:wrapSquare wrapText="bothSides"/>
+            <wp:docPr id="531742486" name="Grafik 4"/>
+            <wp:cNvGraphicFramePr>
+              <a:graphicFrameLocks xmlns:a="http://schemas.openxmlformats.org/drawingml/2006/main" noChangeAspect="1"/>
+            </wp:cNvGraphicFramePr>
+            <a:graphic xmlns:a="http://schemas.openxmlformats.org/drawingml/2006/main">
+              <a:graphicData uri="http://schemas.openxmlformats.org/drawingml/2006/picture">
+                <pic:pic xmlns:pic="http://schemas.openxmlformats.org/drawingml/2006/picture">
+                  <pic:nvPicPr>
+                    <pic:cNvPr id="0" name="Picture 7"/>
+                    <pic:cNvPicPr>
+                      <a:picLocks noChangeAspect="1" noChangeArrowheads="1"/>
+                    </pic:cNvPicPr>
+                  </pic:nvPicPr>
+                  <pic:blipFill>
+                    <a:blip r:embed="rId19">
+                      <a:extLst>
+                        <a:ext uri="{28A0092B-C50C-407E-A947-70E740481C1C}">
+                          <a14:useLocalDpi xmlns:a14="http://schemas.microsoft.com/office/drawing/2010/main" val="0"/>
+                        </a:ext>
+                      </a:extLst>
+                    </a:blip>
+                    <a:srcRect/>
+                    <a:stretch>
+                      <a:fillRect/>
+                    </a:stretch>
+                  </pic:blipFill>
+                  <pic:spPr bwMode="auto">
+                    <a:xfrm>
+                      <a:off x="0" y="0"/>
+                      <a:ext cx="7614920" cy="7614920"/>
+                    </a:xfrm>
+                    <a:prstGeom prst="rect">
+                      <a:avLst/>
+                    </a:prstGeom>
+                    <a:noFill/>
+                    <a:ln>
+                      <a:noFill/>
+                    </a:ln>
+                  </pic:spPr>
+                </pic:pic>
+              </a:graphicData>
+            </a:graphic>
+          </wp:anchor>
+        </w:drawing>
+      </w:r>
+      <w:r>
+        <w:drawing>
+          <wp:anchor distT="0" distB="0" distL="114300" distR="114300" simplePos="0" relativeHeight="251699200" behindDoc="0" locked="0" layoutInCell="1" allowOverlap="1" wp14:anchorId="449EEEE2" wp14:editId="5E0933FF">
+            <wp:simplePos x="0" y="0"/>
+            <wp:positionH relativeFrom="column">
+              <wp:posOffset>5451779</wp:posOffset>
+            </wp:positionH>
+            <wp:positionV relativeFrom="paragraph">
+              <wp:posOffset>6059805</wp:posOffset>
+            </wp:positionV>
+            <wp:extent cx="1725295" cy="1186180"/>
+            <wp:effectExtent l="0" t="0" r="0" b="0"/>
+            <wp:wrapSquare wrapText="bothSides"/>
+            <wp:docPr id="77921739" name="Grafik 1"/>
+            <wp:cNvGraphicFramePr>
+              <a:graphicFrameLocks xmlns:a="http://schemas.openxmlformats.org/drawingml/2006/main" noChangeAspect="1"/>
+            </wp:cNvGraphicFramePr>
+            <a:graphic xmlns:a="http://schemas.openxmlformats.org/drawingml/2006/main">
+              <a:graphicData uri="http://schemas.openxmlformats.org/drawingml/2006/picture">
+                <pic:pic xmlns:pic="http://schemas.openxmlformats.org/drawingml/2006/picture">
+                  <pic:nvPicPr>
+                    <pic:cNvPr id="227972951" name=""/>
+                    <pic:cNvPicPr/>
+                  </pic:nvPicPr>
+                  <pic:blipFill rotWithShape="1">
+                    <a:blip r:embed="rId20">
+                      <a:extLst>
+                        <a:ext uri="{28A0092B-C50C-407E-A947-70E740481C1C}">
+                          <a14:useLocalDpi xmlns:a14="http://schemas.microsoft.com/office/drawing/2010/main" val="0"/>
+                        </a:ext>
+                      </a:extLst>
+                    </a:blip>
+                    <a:srcRect l="1" t="50483" r="-26332"/>
+                    <a:stretch>
+                      <a:fillRect/>
+                    </a:stretch>
+                  </pic:blipFill>
+                  <pic:spPr bwMode="auto">
+                    <a:xfrm>
+                      <a:off x="0" y="0"/>
+                      <a:ext cx="1725295" cy="1186180"/>
+                    </a:xfrm>
+                    <a:prstGeom prst="rect">
+                      <a:avLst/>
+                    </a:prstGeom>
+                    <a:ln>
+                      <a:noFill/>
+                    </a:ln>
+                    <a:extLst>
+                      <a:ext uri="{53640926-AAD7-44D8-BBD7-CCE9431645EC}">
+                        <a14:shadowObscured xmlns:a14="http://schemas.microsoft.com/office/drawing/2010/main"/>
+                      </a:ext>
+                    </a:extLst>
+                  </pic:spPr>
+                </pic:pic>
+              </a:graphicData>
+            </a:graphic>
+            <wp14:sizeRelH relativeFrom="margin">
+              <wp14:pctWidth>0</wp14:pctWidth>
+            </wp14:sizeRelH>
+            <wp14:sizeRelV relativeFrom="margin">
+              <wp14:pctHeight>0</wp14:pctHeight>
+            </wp14:sizeRelV>
+          </wp:anchor>
+        </w:drawing>
+      </w:r>
+      <w:r>
+        <w:drawing>
+          <wp:anchor distT="0" distB="0" distL="114300" distR="114300" simplePos="0" relativeHeight="251697152" behindDoc="0" locked="0" layoutInCell="1" allowOverlap="1" wp14:anchorId="4E40B8C3" wp14:editId="08DB4613">
+            <wp:simplePos x="0" y="0"/>
+            <wp:positionH relativeFrom="column">
+              <wp:posOffset>4273550</wp:posOffset>
+            </wp:positionH>
+            <wp:positionV relativeFrom="paragraph">
+              <wp:posOffset>5972810</wp:posOffset>
+            </wp:positionV>
+            <wp:extent cx="1350010" cy="1136650"/>
+            <wp:effectExtent l="0" t="0" r="2540" b="6350"/>
+            <wp:wrapSquare wrapText="bothSides"/>
+            <wp:docPr id="227972951" name="Grafik 1"/>
+            <wp:cNvGraphicFramePr>
+              <a:graphicFrameLocks xmlns:a="http://schemas.openxmlformats.org/drawingml/2006/main" noChangeAspect="1"/>
+            </wp:cNvGraphicFramePr>
+            <a:graphic xmlns:a="http://schemas.openxmlformats.org/drawingml/2006/main">
+              <a:graphicData uri="http://schemas.openxmlformats.org/drawingml/2006/picture">
+                <pic:pic xmlns:pic="http://schemas.openxmlformats.org/drawingml/2006/picture">
+                  <pic:nvPicPr>
+                    <pic:cNvPr id="227972951" name=""/>
+                    <pic:cNvPicPr/>
+                  </pic:nvPicPr>
+                  <pic:blipFill rotWithShape="1">
+                    <a:blip r:embed="rId20">
+                      <a:extLst>
+                        <a:ext uri="{28A0092B-C50C-407E-A947-70E740481C1C}">
+                          <a14:useLocalDpi xmlns:a14="http://schemas.microsoft.com/office/drawing/2010/main" val="0"/>
+                        </a:ext>
+                      </a:extLst>
+                    </a:blip>
+                    <a:srcRect b="51994"/>
+                    <a:stretch>
+                      <a:fillRect/>
+                    </a:stretch>
+                  </pic:blipFill>
+                  <pic:spPr bwMode="auto">
+                    <a:xfrm>
+                      <a:off x="0" y="0"/>
+                      <a:ext cx="1350010" cy="1136650"/>
+                    </a:xfrm>
+                    <a:prstGeom prst="rect">
+                      <a:avLst/>
+                    </a:prstGeom>
+                    <a:ln>
+                      <a:noFill/>
+                    </a:ln>
+                    <a:extLst>
+                      <a:ext uri="{53640926-AAD7-44D8-BBD7-CCE9431645EC}">
+                        <a14:shadowObscured xmlns:a14="http://schemas.microsoft.com/office/drawing/2010/main"/>
+                      </a:ext>
+                    </a:extLst>
+                  </pic:spPr>
+                </pic:pic>
+              </a:graphicData>
+            </a:graphic>
+            <wp14:sizeRelH relativeFrom="margin">
+              <wp14:pctWidth>0</wp14:pctWidth>
+            </wp14:sizeRelH>
+            <wp14:sizeRelV relativeFrom="margin">
+              <wp14:pctHeight>0</wp14:pctHeight>
+            </wp14:sizeRelV>
+          </wp:anchor>
+        </w:drawing>
+      </w:r>
+    </w:p>
+    <w:p>
+      <w:pPr>
+        <w:tabs>
+          <w:tab w:val="left" w:pos="15741"/>
+        </w:tabs>
+      </w:pPr>
+    </w:p>
+    <w:p>
+      <w:pPr>
+        <w:tabs>
+          <w:tab w:val="left" w:pos="15741"/>
+        </w:tabs>
+      </w:pPr>
+    </w:p>
+    <w:p>
+      <w:pPr>
+        <w:tabs>
+          <w:tab w:val="left" w:pos="15741"/>
+        </w:tabs>
+      </w:pPr>
+    </w:p>
+    <w:p>
+      <w:pPr>
+        <w:tabs>
+          <w:tab w:val="left" w:pos="15741"/>
+        </w:tabs>
+      </w:pPr>
+    </w:p>
+    <w:p>
+      <w:pPr>
+        <w:tabs>
+          <w:tab w:val="left" w:pos="15741"/>
+        </w:tabs>
+      </w:pPr>
+    </w:p>
+    <w:p>
+      <w:pPr>
+        <w:tabs>
+          <w:tab w:val="left" w:pos="15741"/>
+        </w:tabs>
+      </w:pPr>
+    </w:p>
+    <w:p>
+      <w:pPr>
+        <w:tabs>
+          <w:tab w:val="left" w:pos="15741"/>
+        </w:tabs>
+      </w:pPr>
+    </w:p>
+    <w:p>
+      <w:pPr>
+        <w:tabs>
+          <w:tab w:val="left" w:pos="15741"/>
+        </w:tabs>
+      </w:pPr>
+    </w:p>
+    <w:p>
+      <w:pPr>
+        <w:tabs>
+          <w:tab w:val="left" w:pos="15741"/>
+        </w:tabs>
+      </w:pPr>
+      <w:r>
+        <w:rPr>
+          <w:noProof/>
+        </w:rPr>
+        <w:lastRenderedPageBreak/>
+        <w:drawing>
+          <wp:anchor distT="0" distB="0" distL="114300" distR="114300" simplePos="0" relativeHeight="251627493" behindDoc="0" locked="0" layoutInCell="1" allowOverlap="1" wp14:anchorId="06F157F7" wp14:editId="426160C8">
+            <wp:simplePos x="0" y="0"/>
+            <wp:positionH relativeFrom="column">
+              <wp:posOffset>5596758</wp:posOffset>
+            </wp:positionH>
+            <wp:positionV relativeFrom="paragraph">
+              <wp:posOffset>503</wp:posOffset>
+            </wp:positionV>
+            <wp:extent cx="7614920" cy="7614920"/>
+            <wp:effectExtent l="0" t="0" r="5080" b="5080"/>
+            <wp:wrapSquare wrapText="bothSides"/>
+            <wp:docPr id="662276288" name="Grafik 5"/>
+            <wp:cNvGraphicFramePr>
+              <a:graphicFrameLocks xmlns:a="http://schemas.openxmlformats.org/drawingml/2006/main" noChangeAspect="1"/>
+            </wp:cNvGraphicFramePr>
+            <a:graphic xmlns:a="http://schemas.openxmlformats.org/drawingml/2006/main">
+              <a:graphicData uri="http://schemas.openxmlformats.org/drawingml/2006/picture">
+                <pic:pic xmlns:pic="http://schemas.openxmlformats.org/drawingml/2006/picture">
+                  <pic:nvPicPr>
+                    <pic:cNvPr id="0" name="Picture 9"/>
+                    <pic:cNvPicPr>
+                      <a:picLocks noChangeAspect="1" noChangeArrowheads="1"/>
+                    </pic:cNvPicPr>
+                  </pic:nvPicPr>
+                  <pic:blipFill>
+                    <a:blip r:embed="rId21">
+                      <a:extLst>
+                        <a:ext uri="{28A0092B-C50C-407E-A947-70E740481C1C}">
+                          <a14:useLocalDpi xmlns:a14="http://schemas.microsoft.com/office/drawing/2010/main" val="0"/>
+                        </a:ext>
+                      </a:extLst>
+                    </a:blip>
+                    <a:srcRect/>
+                    <a:stretch>
+                      <a:fillRect/>
+                    </a:stretch>
+                  </pic:blipFill>
+                  <pic:spPr bwMode="auto">
+                    <a:xfrm>
+                      <a:off x="0" y="0"/>
+                      <a:ext cx="7614920" cy="7614920"/>
+                    </a:xfrm>
+                    <a:prstGeom prst="rect">
+                      <a:avLst/>
+                    </a:prstGeom>
+                    <a:noFill/>
+                    <a:ln>
+                      <a:noFill/>
+                    </a:ln>
+                  </pic:spPr>
+                </pic:pic>
+              </a:graphicData>
+            </a:graphic>
+          </wp:anchor>
+        </w:drawing>
+      </w:r>
+      <w:r>
+        <w:rPr>
+          <w:noProof/>
+        </w:rPr>
+        <w:drawing>
+          <wp:anchor distT="0" distB="0" distL="114300" distR="114300" simplePos="0" relativeHeight="251696128" behindDoc="0" locked="0" layoutInCell="1" allowOverlap="1" wp14:anchorId="7E4330BE" wp14:editId="25ACF5F0">
+            <wp:simplePos x="0" y="0"/>
+            <wp:positionH relativeFrom="column">
+              <wp:posOffset>9852244</wp:posOffset>
+            </wp:positionH>
+            <wp:positionV relativeFrom="paragraph">
+              <wp:posOffset>5675389</wp:posOffset>
+            </wp:positionV>
+            <wp:extent cx="2553970" cy="1377950"/>
+            <wp:effectExtent l="0" t="0" r="0" b="0"/>
+            <wp:wrapSquare wrapText="bothSides"/>
+            <wp:docPr id="620414192" name="Grafik 33"/>
+            <wp:cNvGraphicFramePr>
+              <a:graphicFrameLocks xmlns:a="http://schemas.openxmlformats.org/drawingml/2006/main" noChangeAspect="1"/>
+            </wp:cNvGraphicFramePr>
+            <a:graphic xmlns:a="http://schemas.openxmlformats.org/drawingml/2006/main">
+              <a:graphicData uri="http://schemas.openxmlformats.org/drawingml/2006/picture">
+                <pic:pic xmlns:pic="http://schemas.openxmlformats.org/drawingml/2006/picture">
+                  <pic:nvPicPr>
+                    <pic:cNvPr id="0" name="Picture 68"/>
+                    <pic:cNvPicPr>
+                      <a:picLocks noChangeAspect="1" noChangeArrowheads="1"/>
+                    </pic:cNvPicPr>
+                  </pic:nvPicPr>
+                  <pic:blipFill rotWithShape="1">
+                    <a:blip r:embed="rId5">
+                      <a:extLst>
+                        <a:ext uri="{28A0092B-C50C-407E-A947-70E740481C1C}">
+                          <a14:useLocalDpi xmlns:a14="http://schemas.microsoft.com/office/drawing/2010/main" val="0"/>
+                        </a:ext>
+                      </a:extLst>
+                    </a:blip>
+                    <a:srcRect l="59113" t="17201" b="49739"/>
+                    <a:stretch>
+                      <a:fillRect/>
+                    </a:stretch>
+                  </pic:blipFill>
+                  <pic:spPr bwMode="auto">
+                    <a:xfrm>
+                      <a:off x="0" y="0"/>
+                      <a:ext cx="2553970" cy="1377950"/>
+                    </a:xfrm>
+                    <a:prstGeom prst="rect">
+                      <a:avLst/>
+                    </a:prstGeom>
+                    <a:noFill/>
+                    <a:ln>
+                      <a:noFill/>
+                    </a:ln>
+                    <a:extLst>
+                      <a:ext uri="{53640926-AAD7-44D8-BBD7-CCE9431645EC}">
+                        <a14:shadowObscured xmlns:a14="http://schemas.microsoft.com/office/drawing/2010/main"/>
+                      </a:ext>
+                    </a:extLst>
+                  </pic:spPr>
+                </pic:pic>
+              </a:graphicData>
+            </a:graphic>
+            <wp14:sizeRelH relativeFrom="margin">
+              <wp14:pctWidth>0</wp14:pctWidth>
+            </wp14:sizeRelH>
             <wp14:sizeRelV relativeFrom="margin">
               <wp14:pctHeight>0</wp14:pctHeight>
             </wp14:sizeRelV>
@@ -1718,6 +2820,7 @@
   <w:style w:type="character" w:default="1" w:styleId="Absatz-Standardschriftart">
     <w:name w:val="Default Paragraph Font"/>
     <w:uiPriority w:val="1"/>
+    <w:semiHidden/>
     <w:unhideWhenUsed/>
   </w:style>
   <w:style w:type="table" w:default="1" w:styleId="NormaleTabelle">

</xml_diff>